<commit_message>
M2, steps 1, 2  in progress,  add tested card catalog abstraction and local catalog, added uuid method to CardDefinition.
</commit_message>
<xml_diff>
--- a/docs/M2_tasks.docx
+++ b/docs/M2_tasks.docx
@@ -104,25 +104,31 @@
         <w:pStyle w:val="Heading1"/>
       </w:pPr>
       <w:r>
-        <w:t>2. Establish M2 object names, module placement, and responsibilities</w:t>
+        <w:t>2. Establish the CardCatalog contract, object names, and module responsibilities</w:t>
       </w:r>
     </w:p>
     <w:p>
       <w:pPr/>
       <w:r>
-        <w:t>☑ Use CardCatalog as the application-facing catalog Protocol; concrete catalog implementations will explicitly inherit from it so the intended interface relationship is visible in the class declaration.</w:t>
+        <w:t>☑ Use CardCatalog as the application-facing catalog abstract base class (ABC) in app/catalogs/card_catalog.py; concrete catalogs explicitly inherit from it so the shared contract is visible in code.</w:t>
       </w:r>
     </w:p>
     <w:p>
       <w:pPr/>
       <w:r>
-        <w:t>☐ Use ScryfallCatalog for the external provider-backed CardCatalog implementation and declare it explicitly as class ScryfallCatalog(CardCatalog).</w:t>
+        <w:t>☐ Use LocalCatalog for the in-memory/local collection of CardDefinition objects and declare it explicitly as class LocalCatalog(CardCatalog).</w:t>
       </w:r>
     </w:p>
     <w:p>
       <w:pPr/>
       <w:r>
-        <w:t>☐ Use LocalCatalog for the M2 in-memory/local collection of manually entered CardDefinition objects and declare it explicitly as class LocalCatalog(CardCatalog).</w:t>
+        <w:t>☐ Use ScryfallCatalog for the external provider-backed implementation and declare it explicitly as class ScryfallCatalog(CardCatalog).</w:t>
+      </w:r>
+    </w:p>
+    <w:p>
+      <w:pPr/>
+      <w:r>
+        <w:t>☑ Define CardCatalog.get_by_name(card_name) -&gt; CardDefinition and CardCatalog.add_card(card) -&gt; bool as abstract operations. Keep storage/data-structure choices in concrete subclasses.</w:t>
       </w:r>
     </w:p>
     <w:p>
@@ -170,7 +176,7 @@
     <w:p>
       <w:pPr/>
       <w:r>
-        <w:t>Naming principle: Prefer small responsibility-oriented types and preserve the project's existing one-object-per-module convention. Use an explicit Protocol inheritance relationship for catalog implementations to make the architectural contract obvious to future maintainers; do not create classes where a simple pure function is clearer, especially for one-step file reading or mapping.</w:t>
+        <w:t>Naming principle: Prefer small responsibility-oriented types and preserve the project's existing one-object-per-module convention. Use explicit CardCatalog inheritance for concrete catalogs so the contract remains obvious to future maintainers; do not create classes where a simple pure function is clearer, especially for one-step file reading or mapping.</w:t>
       </w:r>
     </w:p>
     <w:p>
@@ -224,7 +230,7 @@
     <w:p>
       <w:pPr/>
       <w:r>
-        <w:t>Architecture decision: CardCatalog will use Python typing.Protocol as the catalog contract. LocalCatalog and ScryfallCatalog will explicitly inherit from CardCatalog even though Protocol supports structural typing without inheritance. The explicit declaration is intentional documentation for maintainability and re-learning; Protocol is not being used as an implicit duck-typing shortcut.</w:t>
+        <w:t>Architecture decision: CardCatalog uses abc.ABC with @abstractmethod rather than typing.Protocol. The contract is nominal and runtime-enforced for explicit subclasses. get_by_name(card_name) and add_card(card) are shared abstract operations; concrete catalogs may use different internal data structures and storage mechanics. LocalCatalog and ScryfallCatalog will explicitly inherit from CardCatalog.</w:t>
       </w:r>
     </w:p>
     <w:p>
@@ -305,25 +311,25 @@
     <w:p>
       <w:pPr/>
       <w:r>
-        <w:t>☐ Define the smallest application-facing CardCatalog Protocol needed by deck import and local/manual definitions.</w:t>
+        <w:t>☑ Define the smallest application-facing CardCatalog abstract base class needed by deck import and local/manual definitions.</w:t>
       </w:r>
     </w:p>
     <w:p>
       <w:pPr/>
       <w:r>
-        <w:t>☐ Support resolving a card by a normalized user-facing name.</w:t>
+        <w:t>☐ Support resolving a card by a normalized user-facing name through get_by_name().</w:t>
       </w:r>
     </w:p>
     <w:p>
       <w:pPr/>
       <w:r>
-        <w:t>☐ Return catalog-neutral CardDefinition objects to the rest of the application.</w:t>
+        <w:t>☐ Return catalog-neutral CardDefinition objects to the rest of the application and accept CardDefinition objects through add_card().</w:t>
       </w:r>
     </w:p>
     <w:p>
       <w:pPr/>
       <w:r>
-        <w:t>☐ Require LocalCatalog and ScryfallCatalog to explicitly inherit from CardCatalog while satisfying the same lookup contract; use the inheritance declaration as visible interface documentation rather than relying only on implicit structural typing.</w:t>
+        <w:t>☑ Require LocalCatalog and ScryfallCatalog to explicitly inherit from CardCatalog and implement the shared abstract operations; use the inheritance declaration as visible contract documentation.</w:t>
       </w:r>
     </w:p>
     <w:p>
@@ -789,6 +795,12 @@
     <w:p>
       <w:pPr/>
       <w:r>
+        <w:t>☐ Run and pass focused CardCatalog contract tests: a complete explicit subclass can be instantiated/used, while a subclass missing required abstract methods cannot be instantiated.</w:t>
+      </w:r>
+    </w:p>
+    <w:p>
+      <w:pPr/>
+      <w:r>
         <w:t>☐ Use fictional/local fixtures for parser, manual-entry, local-catalog, and deck-construction tests.</w:t>
       </w:r>
     </w:p>
@@ -1117,7 +1129,7 @@
     <w:p>
       <w:pPr/>
       <w:r>
-        <w:t>☐ Review that module placement still follows responsibility and the existing one-object-per-module convention, and that concrete catalog implementations visibly inherit from the CardCatalog Protocol without unnecessary inheritance elsewhere.</w:t>
+        <w:t>☐ Review that module placement still follows responsibility and the existing one-object-per-module convention, and that concrete catalog implementations visibly inherit from the CardCatalog abstract base class without unnecessary inheritance elsewhere.</w:t>
       </w:r>
     </w:p>
     <w:p>
@@ -1161,7 +1173,7 @@
     <w:p>
       <w:pPr/>
       <w:r>
-        <w:t>☐ Document the CardCatalog Protocol boundary and the explicit ScryfallCatalog/LocalCatalog implementation relationship.</w:t>
+        <w:t>☐ Document the CardCatalog abstract-base-class boundary and the explicit ScryfallCatalog/LocalCatalog implementation relationship.</w:t>
       </w:r>
     </w:p>
     <w:p>
@@ -1345,7 +1357,7 @@
     <w:p>
       <w:pPr/>
       <w:r>
-        <w:t>☐ A CardCatalog Protocol boundary exists, returns catalog-neutral CardDefinition objects, and concrete catalog implementations explicitly inherit from it for a visible interface relationship.</w:t>
+        <w:t>☐ A CardCatalog abstract base class boundary exists, returns catalog-neutral CardDefinition objects, and concrete catalog implementations explicitly inherit from it for a visible catalog-contract relationship.</w:t>
       </w:r>
     </w:p>
     <w:p>

</xml_diff>

<commit_message>
M2, step2 in progress.  Working on architecture of adding cards.  in progress. commit and push for ability to work on another workstation
</commit_message>
<xml_diff>
--- a/docs/M2_tasks.docx
+++ b/docs/M2_tasks.docx
@@ -116,19 +116,25 @@
     <w:p>
       <w:pPr/>
       <w:r>
-        <w:t>☐ Use LocalCatalog for the in-memory/local collection of CardDefinition objects and declare it explicitly as class LocalCatalog(CardCatalog).</w:t>
+        <w:t>☑ Use LocalCatalog for the in-memory/local collection of CardDefinition objects and declare it explicitly as class LocalCatalog(CardCatalog).</w:t>
       </w:r>
     </w:p>
     <w:p>
       <w:pPr/>
       <w:r>
-        <w:t>☐ Use ScryfallCatalog for the external provider-backed implementation and declare it explicitly as class ScryfallCatalog(CardCatalog).</w:t>
+        <w:t>☐ Use ScryfallCatalog for the externally backed catalog implementation and declare it explicitly as class ScryfallCatalog(CardCatalog); it retains normal local catalog behavior while adding non-local acquisition when a requested definition is absent locally.</w:t>
       </w:r>
     </w:p>
     <w:p>
       <w:pPr/>
       <w:r>
-        <w:t>☑ Define CardCatalog.get_by_name(card_name) -&gt; CardDefinition and CardCatalog.add_card(card) -&gt; bool as abstract operations. Keep storage/data-structure choices in concrete subclasses.</w:t>
+        <w:t>☐ Use ScryfallAdapter in app/catalogs/scryfall_adapter.py for Scryfall-specific HTTP/transport/response mapping concerns; compose it into ScryfallCatalog rather than making provider transport part of the CardCatalog contract.</w:t>
+      </w:r>
+    </w:p>
+    <w:p>
+      <w:pPr/>
+      <w:r>
+        <w:t>☐ Define CardCatalog.get_by_name(card_name: str) -&gt; CardDefinition and CardCatalog.add_card(card: CardDefinition) as abstract operations. Keep storage/data-structure choices in concrete subclasses, and reconcile/document add_card return semantics before closing this contract task.</w:t>
       </w:r>
     </w:p>
     <w:p>
@@ -158,7 +164,19 @@
     <w:p>
       <w:pPr/>
       <w:r>
-        <w:t>☐ Use ManualCardEntryCLI for the command-line data-entry workflow; keep CLI prompting separate from domain validation and catalog storage.</w:t>
+        <w:t>☐ Use ManualCardEntryCLI in app/cli/manual_card_entry_cli.py for terminal prompting and collection of user-entered values; keep CLI presentation separate from domain validation and catalog storage.</w:t>
+      </w:r>
+    </w:p>
+    <w:p>
+      <w:pPr/>
+      <w:r>
+        <w:t>☐ Keep future browser/manual entry endpoints in app/api; CLI and API are presentation layers that may consume the same interrogator/field description.</w:t>
+      </w:r>
+    </w:p>
+    <w:p>
+      <w:pPr/>
+      <w:r>
+        <w:t>☐ Use MtgCardDefinitionInterrogator in app/catalogs/mtg_card_definition_interrogator.py to describe the MTG card-definition fields/prompts required by manual entry; it supplies field metadata to a UI but does not itself call input() or render a web form.</w:t>
       </w:r>
     </w:p>
     <w:p>
@@ -224,13 +242,13 @@
     <w:p>
       <w:pPr/>
       <w:r>
-        <w:t>Architecture decision: Module placement follows responsibility: catalogs acquire/resolve definitions, models hold reusable data/domain objects, services coordinate workflows, game owns game-state behavior, and cli owns command-line interaction. Existing one-object-per-file structure remains the default.</w:t>
+        <w:t>Architecture decision: Module placement follows responsibility: catalogs acquire/resolve definitions and contain catalog/provider/interrogator components; models hold reusable data/domain objects; services coordinate workflows; game owns game-state behavior; cli owns terminal interaction; and api owns future HTTP/web presentation. Existing one-object-per-file structure remains the default.</w:t>
       </w:r>
     </w:p>
     <w:p>
       <w:pPr/>
       <w:r>
-        <w:t>Architecture decision: CardCatalog uses abc.ABC with @abstractmethod rather than typing.Protocol. The contract is nominal and runtime-enforced for explicit subclasses. get_by_name(card_name) and add_card(card) are shared abstract operations; concrete catalogs may use different internal data structures and storage mechanics. LocalCatalog and ScryfallCatalog will explicitly inherit from CardCatalog.</w:t>
+        <w:t>Architecture decision: CardCatalog uses abc.ABC with @abstractmethod rather than typing.Protocol. The contract is nominal and runtime-enforced for explicit subclasses. get_by_name(card_name) and add_card(card) are shared abstract operations; concrete catalogs may use different internal data structures and storage mechanics. LocalCatalog and ScryfallCatalog explicitly inherit from CardCatalog. The base class defines the contract but does not implement collection storage.</w:t>
       </w:r>
     </w:p>
     <w:p>
@@ -317,13 +335,13 @@
     <w:p>
       <w:pPr/>
       <w:r>
-        <w:t>☐ Support resolving a card by a normalized user-facing name through get_by_name().</w:t>
+        <w:t>☐ Support resolving a card by a normalized user-facing name through get_by_name(); LocalCatalog currently supports exact-name lookup and normalization remains a later task.</w:t>
       </w:r>
     </w:p>
     <w:p>
       <w:pPr/>
       <w:r>
-        <w:t>☐ Return catalog-neutral CardDefinition objects to the rest of the application and accept CardDefinition objects through add_card().</w:t>
+        <w:t>☑ Return catalog-neutral CardDefinition objects to the rest of the application and accept CardDefinition objects through add_card().</w:t>
       </w:r>
     </w:p>
     <w:p>
@@ -347,7 +365,13 @@
     <w:p>
       <w:pPr/>
       <w:r>
-        <w:t>☐ Do not require a CardCatalog implementation to know about deck quantities, deck files, GameState, or CardInstance creation.</w:t>
+        <w:t>☑ Do not require a CardCatalog implementation to know about deck quantities, deck files, GameState, or CardInstance creation.</w:t>
+      </w:r>
+    </w:p>
+    <w:p>
+      <w:pPr/>
+      <w:r>
+        <w:t>☑ Implement LocalCatalog with one authoritative in-memory dictionary keyed by CardDefinition.definition_id; get_by_name() may scan stored CardDefinition values in M2 rather than maintaining a secondary mutable name index.</w:t>
       </w:r>
     </w:p>
     <w:p>
@@ -361,13 +385,13 @@
     <w:p>
       <w:pPr/>
       <w:r>
-        <w:t>☐ Identify the minimum catalog-neutral fields required to construct a valid CardDefinition in M2.</w:t>
+        <w:t>☑ Identify the minimum universally required CardDefinition fields for M2: definition_id and name remain the stable core identity fields; game-specific descriptive data should not be promoted into the universal core merely because MTG/Scryfall supplies it.</w:t>
       </w:r>
     </w:p>
     <w:p>
       <w:pPr/>
       <w:r>
-        <w:t>☐ Decide how manually created definitions receive stable definition_id values; document whether IDs are supplied, generated, or namespaced locally.</w:t>
+        <w:t>☑ Decide how manually created definitions receive stable definition_id values: CardDefinition.new(name) generates a UUID definition_id for locally/manual-created definitions.</w:t>
       </w:r>
     </w:p>
     <w:p>
@@ -379,19 +403,43 @@
     <w:p>
       <w:pPr/>
       <w:r>
-        <w:t>☐ Let CardDefinition/domain validation enforce domain requirements; do not make manual CLI prompts or Scryfall transport code the sole validator.</w:t>
+        <w:t>☑ Let CardDefinition/domain validation enforce domain requirements; CardDefinition remains a Pydantic BaseModel and CardDefinition.new(name) constructs through normal model validation.</w:t>
       </w:r>
     </w:p>
     <w:p>
       <w:pPr/>
       <w:r>
-        <w:t>☐ Avoid introducing a second mutable definition representation unless a CardDefinitionInput staging model has a clear purpose.</w:t>
+        <w:t>☑ Avoid introducing a second mutable definition representation unless a CardDefinitionInput staging model has a clear purpose; none is currently needed.</w:t>
       </w:r>
     </w:p>
     <w:p>
       <w:pPr/>
       <w:r>
-        <w:t>☐ Do not add Scryfall-only fields to CardDefinition merely because the provider supplies them.</w:t>
+        <w:t>Current M2 decision: prefer one authoritative local definition collection keyed by definition_id. Name lookup is intentionally O(n) for the small M2 local catalog; add a derived secondary name index only if later scale or profiling justifies the synchronization complexity.</w:t>
+      </w:r>
+    </w:p>
+    <w:p>
+      <w:pPr/>
+      <w:r>
+        <w:t>☐ Decide the smallest M2 representation for additional game-specific descriptive data before Scryfall mapping begins. Prefer a replaceable/composed game-data component or neutral property container over expanding the universal CardDefinition with MTG-only fields.</w:t>
+      </w:r>
+    </w:p>
+    <w:p>
+      <w:pPr/>
+      <w:r>
+        <w:t>☐ Keep any M2 game-data representation narrow and validated enough for current import/manual-entry needs; do not dump raw Scryfall payloads into CardDefinition.</w:t>
+      </w:r>
+    </w:p>
+    <w:p>
+      <w:pPr/>
+      <w:r>
+        <w:t>☐ Treat a typed, hot-swappable game-specific data component (for example an MTG definition-data model) as the likely future direction if concrete requirements justify it; do not build a general game plug-in/template framework in M2.</w:t>
+      </w:r>
+    </w:p>
+    <w:p>
+      <w:pPr/>
+      <w:r>
+        <w:t>Architecture direction: CardDefinition should preserve stable universal identity while allowing game-specific descriptive shape to vary by selected game implementation. A future GameDefinition/GameTemplate may supply card-data schema, catalog conventions, and zone structure, but M2 should only avoid blocking that direction rather than implement it.</w:t>
       </w:r>
     </w:p>
     <w:p>
@@ -399,19 +447,25 @@
         <w:pStyle w:val="Heading1"/>
       </w:pPr>
       <w:r>
-        <w:t>6. Implement the Scryfall adapter</w:t>
+        <w:t>6. Implement ScryfallCatalog and its provider adapter</w:t>
       </w:r>
     </w:p>
     <w:p>
       <w:pPr/>
       <w:r>
-        <w:t>☐ Create ScryfallCatalog in app/catalogs/scryfall_catalog.py when the external adapter slice begins.</w:t>
+        <w:t>☐ Create ScryfallCatalog in app/catalogs/scryfall_catalog.py as a CardCatalog that first uses its local definition collection and performs non-local acquisition only when appropriate.</w:t>
       </w:r>
     </w:p>
     <w:p>
       <w:pPr/>
       <w:r>
-        <w:t>☐ Use HTTPX through a small, testable client boundary.</w:t>
+        <w:t>☐ Create/compose ScryfallAdapter as the small, testable provider boundary and use HTTPX inside that adapter rather than directly in general catalog/domain code.</w:t>
+      </w:r>
+    </w:p>
+    <w:p>
+      <w:pPr/>
+      <w:r>
+        <w:t>☐ Have ScryfallCatalog ask ScryfallAdapter to resolve a missing card, convert the result into the M2 CardDefinition/game-data representation, add it to the catalog collection, and return the resulting definition.</w:t>
       </w:r>
     </w:p>
     <w:p>
@@ -423,7 +477,7 @@
     <w:p>
       <w:pPr/>
       <w:r>
-        <w:t>☐ Map only the fields currently needed into CardDefinition rather than copying the entire provider response into the domain.</w:t>
+        <w:t>☐ Map only the currently needed Scryfall values into the universal CardDefinition fields and the chosen M2 game-data/property representation; do not copy the entire provider response into the domain.</w:t>
       </w:r>
     </w:p>
     <w:p>
@@ -461,13 +515,13 @@
     <w:p>
       <w:pPr/>
       <w:r>
-        <w:t>☐ Do not add Scryfall-only fields to CardDefinition merely because the API provides them.</w:t>
+        <w:t>☐ Do not add Scryfall/provider-only fields to the universal CardDefinition merely because the API provides them; distinguish game-semantic data from provider transport/metadata.</w:t>
       </w:r>
     </w:p>
     <w:p>
       <w:pPr/>
       <w:r>
-        <w:t>☐ Add an explicit mapping step from provider data to CardDefinition or to the shared neutral definition-input path.</w:t>
+        <w:t>☐ Add an explicit mapping step from provider data to CardDefinition plus the chosen game-specific data/property component, or to a justified shared neutral input path.</w:t>
       </w:r>
     </w:p>
     <w:p>
@@ -575,19 +629,37 @@
         <w:pStyle w:val="Heading1"/>
       </w:pPr>
       <w:r>
-        <w:t>10. Implement manual CardDefinition CLI entry</w:t>
+        <w:t>10. Define MTG manual-entry fields and implement ManualCardEntryCLI</w:t>
       </w:r>
     </w:p>
     <w:p>
       <w:pPr/>
       <w:r>
-        <w:t>☐ Provide an M2 command-line workflow (in a dedicated app/cli module if warranted) for entering the minimum fields required for a CardDefinition.</w:t>
+        <w:t>☐ Define MtgCardDefinitionInterrogator as a reusable description of the MTG fields needed for M2 manual card definition entry; include field names/prompts, required/optional status, and simple field type/default metadata only where it materially helps the UI.</w:t>
       </w:r>
     </w:p>
     <w:p>
       <w:pPr/>
       <w:r>
-        <w:t>☐ Keep terminal prompting/input handling outside CardDefinition and CardCatalog domain behavior.</w:t>
+        <w:t>☐ Keep MtgCardDefinitionInterrogator presentation-neutral so a future app/api web/manual-entry endpoint can render the same field description without re-encoding MTG field requirements.</w:t>
+      </w:r>
+    </w:p>
+    <w:p>
+      <w:pPr/>
+      <w:r>
+        <w:t>☐ Provide ManualCardEntryCLI in app/cli to read the interrogator field description, prompt the terminal user, collect values, construct a CardDefinition, and add it to the supplied LocalCatalog.</w:t>
+      </w:r>
+    </w:p>
+    <w:p>
+      <w:pPr/>
+      <w:r>
+        <w:t>☐ Include an optional image reference/URI field in the MTG manual-entry description if retained for near-term display; M2 stores the reference only and does not download/cache the image.</w:t>
+      </w:r>
+    </w:p>
+    <w:p>
+      <w:pPr/>
+      <w:r>
+        <w:t>☐ Keep terminal prompting/input handling outside CardDefinition, CardCatalog, and MtgCardDefinitionInterrogator; the CLI owns input()/print()-style interaction.</w:t>
       </w:r>
     </w:p>
     <w:p>
@@ -795,7 +867,13 @@
     <w:p>
       <w:pPr/>
       <w:r>
-        <w:t>☐ Run and pass focused CardCatalog contract tests: a complete explicit subclass can be instantiated/used, while a subclass missing required abstract methods cannot be instantiated.</w:t>
+        <w:t>☐ Run and pass focused CardCatalog contract tests: positive and negative ABC tests have been written; confirm the complete explicit subclass can be instantiated/used and an incomplete subclass cannot be instantiated after final cleanup.</w:t>
+      </w:r>
+    </w:p>
+    <w:p>
+      <w:pPr/>
+      <w:r>
+        <w:t>☐ Add/confirm focused CardDefinition.new(name) tests that preserve the supplied name and generate distinct nonempty definition_id values; treat large-sample UUID uniqueness as a sanity/regression check rather than a proof.</w:t>
       </w:r>
     </w:p>
     <w:p>
@@ -843,7 +921,25 @@
     <w:p>
       <w:pPr/>
       <w:r>
-        <w:t>☐ Test manually entered data produces a valid CardDefinition and can be stored/resolved through LocalCatalog.</w:t>
+        <w:t>☐ Test manually entered data produces a valid CardDefinition and can be stored/resolved through LocalCatalog; basic LocalCatalog add/get-by-name tests now exist, while interrogator/CLI manual-entry integration remains pending.</w:t>
+      </w:r>
+    </w:p>
+    <w:p>
+      <w:pPr/>
+      <w:r>
+        <w:t>☐ Test ManualCardEntryCLI with injected/faked input behavior so one-entry/stop and multi-entry/stop workflows can be verified without interactive keyboard input.</w:t>
+      </w:r>
+    </w:p>
+    <w:p>
+      <w:pPr/>
+      <w:r>
+        <w:t>☐ Test MtgCardDefinitionInterrogator exposes the expected M2 field description without performing terminal or HTTP I/O.</w:t>
+      </w:r>
+    </w:p>
+    <w:p>
+      <w:pPr/>
+      <w:r>
+        <w:t>☐ Define and test LocalCatalog duplicate-definition/name behavior before relying on replacement or ambiguity semantics.</w:t>
       </w:r>
     </w:p>
     <w:p>
@@ -911,7 +1007,7 @@
     <w:p>
       <w:pPr/>
       <w:r>
-        <w:t>☐ Mock HTTPX or the transport boundary for ScryfallCatalog tests.</w:t>
+        <w:t>☐ Mock/fake ScryfallAdapter for ScryfallCatalog behavior tests, and mock HTTPX at the adapter boundary for provider-transport tests.</w:t>
       </w:r>
     </w:p>
     <w:p>
@@ -1105,7 +1201,13 @@
     <w:p>
       <w:pPr/>
       <w:r>
-        <w:t>☐ Review that Scryfall is an adapter, not a dependency of the core domain.</w:t>
+        <w:t>☐ Review that ScryfallAdapter owns provider HTTP/response concerns, while ScryfallCatalog remains the CardCatalog-facing collection/acquisition component and Scryfall is not a dependency of the core domain.</w:t>
+      </w:r>
+    </w:p>
+    <w:p>
+      <w:pPr/>
+      <w:r>
+        <w:t>☐ Review that MtgCardDefinitionInterrogator describes MTG manual-entry fields without owning CLI input or API rendering, so both presentation paths can reuse it.</w:t>
       </w:r>
     </w:p>
     <w:p>
@@ -1153,7 +1255,13 @@
     <w:p>
       <w:pPr/>
       <w:r>
-        <w:t>☐ Review whether CardDefinition currently has enough catalog-neutral fields for M2; add only fields demonstrably required by import, manual entry, or near-term display.</w:t>
+        <w:t>☐ Review whether CardDefinition preserves a minimal universal identity while game-specific descriptive data remains replaceable/composed; add only fields demonstrably required by import, manual entry, or near-term display.</w:t>
+      </w:r>
+    </w:p>
+    <w:p>
+      <w:pPr/>
+      <w:r>
+        <w:t>☐ Review that any game-specific data container is semantic to the game rather than a raw provider payload, and that the design does not prematurely require a full GameTemplate/plugin framework.</w:t>
       </w:r>
     </w:p>
     <w:p>
@@ -1185,7 +1293,7 @@
     <w:p>
       <w:pPr/>
       <w:r>
-        <w:t>☐ Document the shared CardDefinition acquisition flow and the M2 manual CLI path.</w:t>
+        <w:t>☐ Document the shared CardDefinition acquisition flow, ScryfallCatalog/ScryfallAdapter composition, and the MtgCardDefinitionInterrogator → CLI → LocalCatalog manual-entry path.</w:t>
       </w:r>
     </w:p>
     <w:p>
@@ -1203,7 +1311,7 @@
     <w:p>
       <w:pPr/>
       <w:r>
-        <w:t>☐ Update architecture documentation if CardDefinition mapping or import boundaries changed.</w:t>
+        <w:t>☐ Update architecture documentation if CardDefinition mapping/import boundaries changed, including the future direction of stable core CardDefinition identity plus replaceable game-specific definition data where durable enough to document.</w:t>
       </w:r>
     </w:p>
     <w:p>
@@ -1254,6 +1362,12 @@
       <w:pPr/>
       <w:r>
         <w:t>☐ Deferred: Browser/manual web card-definition entry</w:t>
+      </w:r>
+    </w:p>
+    <w:p>
+      <w:pPr/>
+      <w:r>
+        <w:t>☐ Deferred: General multi-game GameDefinition/GameTemplate plug-in framework, including hot-swappable card schemas and configurable zone/catalog templates beyond the minimal seams needed by M2.</w:t>
       </w:r>
     </w:p>
     <w:p>
@@ -1357,13 +1471,13 @@
     <w:p>
       <w:pPr/>
       <w:r>
-        <w:t>☐ A CardCatalog abstract base class boundary exists, returns catalog-neutral CardDefinition objects, and concrete catalog implementations explicitly inherit from it for a visible catalog-contract relationship.</w:t>
+        <w:t>☐ A CardCatalog abstract base class boundary exists, returns CardDefinition objects with stable universal identity, and concrete catalog implementations explicitly inherit from it for a visible catalog-contract relationship.</w:t>
       </w:r>
     </w:p>
     <w:p>
       <w:pPr/>
       <w:r>
-        <w:t>☐ ScryfallCatalog implements that boundary without leaking provider-specific concerns into the domain.</w:t>
+        <w:t>☐ ScryfallCatalog implements the CardCatalog boundary and composes a ScryfallAdapter for provider-specific HTTP/payload concerns without leaking those concerns into the universal domain model.</w:t>
       </w:r>
     </w:p>
     <w:p>
@@ -1375,7 +1489,7 @@
     <w:p>
       <w:pPr/>
       <w:r>
-        <w:t>☐ A CLI-facing manual entry path can collect the required fields and construct valid CardDefinition objects without a web UI.</w:t>
+        <w:t>☐ MtgCardDefinitionInterrogator describes the required MTG manual-entry fields, and ManualCardEntryCLI can use that description to collect values and construct valid CardDefinition objects without a web UI.</w:t>
       </w:r>
     </w:p>
     <w:p>
@@ -1447,13 +1561,7 @@
     <w:p>
       <w:pPr/>
       <w:r>
-        <w:rPr>
-          <w:b/>
-        </w:rPr>
-        <w:t xml:space="preserve">M2 outcome: </w:t>
-      </w:r>
-      <w:r>
-        <w:t>we can turn a human-readable MTG deck file into trustworthy catalog-neutral card definitions and distinct in-memory card instances, and we can also create custom/local CardDefinition objects through a CLI path that feeds the same downstream model, while keeping external catalog concerns outside the core game model.</w:t>
+        <w:t>M2 outcome: we can turn a human-readable MTG deck file into trustworthy CardDefinition objects with stable universal identity plus appropriately isolated game-specific descriptive data, create distinct in-memory CardInstance objects, create custom/local definitions through a reusable MTG field-description + CLI path, and resolve missing definitions through ScryfallCatalog composed with a provider-specific adapter while keeping provider concerns outside the core game model.</w:t>
       </w:r>
     </w:p>
     <w:sectPr>

</xml_diff>

<commit_message>
M2 in progress. added Interrogator and deck class, restored project plan updated task list
</commit_message>
<xml_diff>
--- a/docs/M2_tasks.docx
+++ b/docs/M2_tasks.docx
@@ -16,25 +16,13 @@
     <w:p>
       <w:pPr/>
       <w:r>
-        <w:rPr>
-          <w:b/>
-        </w:rPr>
-        <w:t xml:space="preserve">Objective: </w:t>
-      </w:r>
-      <w:r>
-        <w:t>connect the catalog-neutral core domain to MTG card data through a narrow Scryfall adapter, ingest plain-text deck files, support direct CLI entry of custom/local card definitions, resolve deck names into CardDefinition objects, and create the correct number of distinct CardInstance objects for an imported deck.</w:t>
+        <w:t>Objective: connect the catalog-neutral core domain to MTG card data through a narrow Scryfall adapter, ingest plain-text deck files, support direct CLI entry of custom/local card definitions, resolve deck names into CardDefinition objects, create the correct number of distinct CardInstance objects, and collect those instances into a pre-game Deck object without creating gameplay state.</w:t>
       </w:r>
     </w:p>
     <w:p>
       <w:pPr/>
       <w:r>
-        <w:rPr>
-          <w:b/>
-        </w:rPr>
-        <w:t xml:space="preserve">Stopping rule: </w:t>
-      </w:r>
-      <w:r>
-        <w:t>M2 is complete when a representative plain-text MTG deck file can be parsed and resolved through either an external or local catalog path, manual CLI entry can create usable catalog-neutral CardDefinition objects, resolved deck entries can be converted into distinct card instances, and the behavior is verified by automated tests without adding gameplay actions, persistence, WebSockets, multiplayer, or web card-entry UI.</w:t>
+        <w:t>Stopping rule: M2 is complete when a representative plain-text MTG deck file can be parsed and resolved through either an external or local catalog path, manual CLI entry can create usable catalog-neutral CardDefinition objects, resolved deck entries can be converted into distinct card instances collected in a Deck object, and the behavior is verified by automated tests without adding gameplay actions, saved persistence, WebSockets, multiplayer, or web card-entry UI.</w:t>
       </w:r>
     </w:p>
     <w:p>
@@ -164,31 +152,31 @@
     <w:p>
       <w:pPr/>
       <w:r>
-        <w:t>☐ Use ManualCardEntryCLI in app/cli/manual_card_entry_cli.py for terminal prompting and collection of user-entered values; keep CLI presentation separate from domain validation and catalog storage.</w:t>
+        <w:t>☐ Use ManualCardEntryCLI in app/cli/manual_card_entry_cli.py as a thin terminal presentation/orchestration layer. It may offer M2 commands to create a manual CardDefinition, acquire one or more definitions through a supplied catalog such as ScryfallCatalog, create a Deck from entered/resolved card quantities, and load/import a Deck from a plain-text deck file.</w:t>
       </w:r>
     </w:p>
     <w:p>
       <w:pPr/>
       <w:r>
-        <w:t>☐ Keep future browser/manual entry endpoints in app/api; CLI and API are presentation layers that may consume the same interrogator/field description.</w:t>
+        <w:t>☐ Keep future browser/manual entry endpoints in app/api; CLI and API are presentation layers that should reuse the same catalog, template/interrogator, parser, and importer services rather than reimplementing domain behavior.</w:t>
       </w:r>
     </w:p>
     <w:p>
       <w:pPr/>
       <w:r>
-        <w:t>☐ Use MtgCardDefinitionInterrogator in app/catalogs/mtg_card_definition_interrogator.py to describe the MTG card-definition fields/prompts required by manual entry; it supplies field metadata to a UI but does not itself call input() or render a web form.</w:t>
+        <w:t>☑ Use CardDefinitionInterrogator in app/catalogs/card_definition_interrogator.py to load a game-specific field template (currently MTG JSON) and expose the ordered field-name list to a UI. It does not itself call input(), render a web form, or create cards.</w:t>
       </w:r>
     </w:p>
     <w:p>
       <w:pPr/>
       <w:r>
-        <w:t>☐ Use DeckImporter for orchestration of parsed entries, catalog resolution, and CardInstance creation.</w:t>
+        <w:t>☐ Use DeckImporter for orchestration of parsed entries, catalog resolution, CardInstance creation, and construction of the resulting Deck.</w:t>
       </w:r>
     </w:p>
     <w:p>
       <w:pPr/>
       <w:r>
-        <w:t>☐ Use DeckImportResult and DeckImportError for import outcome/error reporting if separate result models are justified by implementation.</w:t>
+        <w:t>☐ Use DeckImportResult and DeckImportError for import outcome/error reporting if separate result models are justified by implementation; a successful result should expose the constructed Deck rather than an unrelated duplicate card collection.</w:t>
       </w:r>
     </w:p>
     <w:p>
@@ -242,7 +230,7 @@
     <w:p>
       <w:pPr/>
       <w:r>
-        <w:t>Architecture decision: Module placement follows responsibility: catalogs acquire/resolve definitions and contain catalog/provider/interrogator components; models hold reusable data/domain objects; services coordinate workflows; game owns game-state behavior; cli owns terminal interaction; and api owns future HTTP/web presentation. Existing one-object-per-file structure remains the default.</w:t>
+        <w:t>Architecture decision: Module placement follows responsibility: catalogs acquire/resolve definitions and contain catalog/provider/template-interrogator components; models hold reusable data/domain objects including Deck; services coordinate workflows; game owns authoritative game-state behavior; cli owns terminal interaction; and api owns future HTTP/web presentation. Existing one-object-per-file structure remains the default.</w:t>
       </w:r>
     </w:p>
     <w:p>
@@ -635,36 +623,60 @@
     <w:p>
       <w:pPr/>
       <w:r>
-        <w:t>☐ Define MtgCardDefinitionInterrogator as a reusable description of the MTG fields needed for M2 manual card definition entry; include field names/prompts, required/optional status, and simple field type/default metadata only where it materially helps the UI.</w:t>
+        <w:t>☑ Define CardDefinitionInterrogator as a presentation-neutral loader/exposer of a game-specific JSON card-field template. The current MTG template supplies an ordered list of field names needed by manual entry; richer per-field metadata is deferred until a UI requirement justifies it.</w:t>
       </w:r>
     </w:p>
     <w:p>
       <w:pPr/>
       <w:r>
-        <w:t>☐ Keep MtgCardDefinitionInterrogator presentation-neutral so a future app/api web/manual-entry endpoint can render the same field description without re-encoding MTG field requirements.</w:t>
+        <w:t>☑ Keep CardDefinitionInterrogator presentation-neutral: get_fields() returns the field list and the CLI or future API owns iteration, prompting/rendering, and collection of values. No interrogate() method is required unless later behavior justifies one.</w:t>
       </w:r>
     </w:p>
     <w:p>
       <w:pPr/>
       <w:r>
-        <w:t>☐ Provide ManualCardEntryCLI in app/cli to read the interrogator field description, prompt the terminal user, collect values, construct a CardDefinition, and add it to the supplied LocalCatalog.</w:t>
+        <w:t>☐ Provide ManualCardEntryCLI in app/cli. The CLI should obtain the selected game field list from CardDefinitionInterrogator, iterate those fields, collect user values, construct a CardDefinition, and add it to the supplied LocalCatalog.</w:t>
       </w:r>
     </w:p>
     <w:p>
       <w:pPr/>
       <w:r>
-        <w:t>☐ Include an optional image reference/URI field in the MTG manual-entry description if retained for near-term display; M2 stores the reference only and does not download/cache the image.</w:t>
+        <w:t>☐ Define a small CLI command/menu surface for M2: create a manual card definition, acquire one or more definitions from a catalog, create a deck from entered/resolved quantities, and load/import a deck from a plain-text deck file.</w:t>
       </w:r>
     </w:p>
     <w:p>
       <w:pPr/>
       <w:r>
-        <w:t>☐ Keep terminal prompting/input handling outside CardDefinition, CardCatalog, and MtgCardDefinitionInterrogator; the CLI owns input()/print()-style interaction.</w:t>
+        <w:t>☐ Keep external-provider details out of the CLI: loading definitions from Scryfall goes through ScryfallCatalog, not directly through ScryfallAdapter or HTTPX.</w:t>
       </w:r>
     </w:p>
     <w:p>
       <w:pPr/>
       <w:r>
+        <w:t>☐ Keep deck construction logic out of the CLI: the CLI gathers choices/input and delegates parsing, resolution, CardInstance creation, and Deck construction to the appropriate parser/importer/domain components.</w:t>
+      </w:r>
+    </w:p>
+    <w:p>
+      <w:pPr/>
+      <w:r>
+        <w:t>☐ Define M2 terminology clearly: CLI "load deck" means ingest/import a deck source into a Deck object; restoring a previously persisted Deck from storage remains deferred to the persistence milestone.</w:t>
+      </w:r>
+    </w:p>
+    <w:p>
+      <w:pPr/>
+      <w:r>
+        <w:t>☑ Include an image-reference field in the MTG field template if retained for near-term display; M2 stores a reference only and does not download/cache image data.</w:t>
+      </w:r>
+    </w:p>
+    <w:p>
+      <w:pPr/>
+      <w:r>
+        <w:t>☑ Keep terminal prompting/input handling outside CardDefinition, CardCatalog, and CardDefinitionInterrogator; the CLI owns input()/print()-style interaction.</w:t>
+      </w:r>
+    </w:p>
+    <w:p>
+      <w:pPr/>
+      <w:r>
         <w:t>☐ Create the same CardDefinition type used by externally resolved cards.</w:t>
       </w:r>
     </w:p>
@@ -683,7 +695,7 @@
     <w:p>
       <w:pPr/>
       <w:r>
-        <w:t>☐ Support entering more than one custom/local card in a CLI session or through repeated invocation as appropriate for the simplest M2 workflow.</w:t>
+        <w:t>☐ Support entering more than one custom/local card in a CLI session using a user-controlled loop; temporary CLI collection state such as cards: list[CardDefinition] is acceptable before definitions are added to the catalog.</w:t>
       </w:r>
     </w:p>
     <w:p>
@@ -696,6 +708,72 @@
       <w:pPr/>
       <w:r>
         <w:t>☐ Do not require persistence of LocalCatalog across application restarts in M2.</w:t>
+      </w:r>
+    </w:p>
+    <w:p>
+      <w:pPr/>
+      <w:r>
+        <w:t>11. Define the pre-game Deck model</w:t>
+      </w:r>
+    </w:p>
+    <w:p>
+      <w:pPr/>
+      <w:r>
+        <w:t>☐ Define Deck in app/models/deck.py as a collection of CardInstance objects produced by deck construction/import.</w:t>
+      </w:r>
+    </w:p>
+    <w:p>
+      <w:pPr/>
+      <w:r>
+        <w:t>☐ Treat Deck as a pre-game deck collection, not as authoritative gameplay location. CardInstance still does not store zone, and GameState/ZoneContainer remain authoritative once cards are placed into a game.</w:t>
+      </w:r>
+    </w:p>
+    <w:p>
+      <w:pPr/>
+      <w:r>
+        <w:t>☐ Preserve the exact CardInstance objects created by the importer; Deck must not copy or recreate instances merely to store them.</w:t>
+      </w:r>
+    </w:p>
+    <w:p>
+      <w:pPr/>
+      <w:r>
+        <w:t>☐ Keep Deck independent of CardCatalog inheritance. Catalogs collect CardDefinition objects; Deck collects CardInstance objects and has different invariants.</w:t>
+      </w:r>
+    </w:p>
+    <w:p>
+      <w:pPr/>
+      <w:r>
+        <w:t>☐ Use an ordered CardInstance collection so imported deck order can be represented if/when ordering becomes meaningful; do not add shuffle/draw behavior in M2.</w:t>
+      </w:r>
+    </w:p>
+    <w:p>
+      <w:pPr/>
+      <w:r>
+        <w:t>☐ Add only minimal Deck collection operations justified by M2 (for example add/membership/count or an exposed validated cards collection); avoid gameplay-zone behavior.</w:t>
+      </w:r>
+    </w:p>
+    <w:p>
+      <w:pPr/>
+      <w:r>
+        <w:t>☐ Keep Deck serializable or straightforward to serialize later, but do not add save/load/database methods or repository implementations in M2.</w:t>
+      </w:r>
+    </w:p>
+    <w:p>
+      <w:pPr/>
+      <w:r>
+        <w:t>Architecture decision: Deck bridges M2 import and the later solo-game workflow. It represents the pre-game set of distinct CardInstance objects; starting a game later will place those same instances into GameState zones rather than making Deck a second location authority.</w:t>
+      </w:r>
+    </w:p>
+    <w:p>
+      <w:pPr/>
+      <w:r>
+        <w:t>Architecture decision: Deck and ZoneContainer remain separate types in M2 even though both hold ordered CardInstance references. Deck represents editable pre-game composition; ZoneContainer represents authoritative live-game location. Do not introduce a shared ABC solely because their internal collections look similar; extract shared mechanics later only if real duplication justifies it.</w:t>
+      </w:r>
+    </w:p>
+    <w:p>
+      <w:pPr/>
+      <w:r>
+        <w:t>Future game-start boundary: loading a Deck into a player library belongs to GameState orchestration (for example initialize_library(...) or load_deck(...)), not to ZoneContainer. The operation should place the same CardInstance objects through GameState-controlled placement so zone membership remains authoritative and deck-building APIs cannot mutate a live game directly. This start-game operation remains deferred beyond M2.</w:t>
       </w:r>
     </w:p>
     <w:p>
@@ -703,7 +781,7 @@
         <w:pStyle w:val="Heading1"/>
       </w:pPr>
       <w:r>
-        <w:t>11. Normalize and validate parsed entries</w:t>
+        <w:t>12. Normalize and validate parsed entries</w:t>
       </w:r>
     </w:p>
     <w:p>
@@ -741,7 +819,7 @@
         <w:pStyle w:val="Heading1"/>
       </w:pPr>
       <w:r>
-        <w:t>12. Implement deck resolution</w:t>
+        <w:t>13. Implement deck resolution</w:t>
       </w:r>
     </w:p>
     <w:p>
@@ -791,13 +869,13 @@
         <w:pStyle w:val="Heading1"/>
       </w:pPr>
       <w:r>
-        <w:t>13. Construct distinct CardInstance objects</w:t>
+        <w:t>14. Construct distinct CardInstance objects</w:t>
       </w:r>
     </w:p>
     <w:p>
       <w:pPr/>
       <w:r>
-        <w:t>☐ Create the requested number of CardInstance objects from each resolved CardDefinition.</w:t>
+        <w:t>☐ Create the requested number of CardInstance objects from each resolved CardDefinition and place those instances into the resulting Deck collection.</w:t>
       </w:r>
     </w:p>
     <w:p>
@@ -821,7 +899,7 @@
     <w:p>
       <w:pPr/>
       <w:r>
-        <w:t>☐ Do not assign gameplay location by mutating CardInstance; placement remains GameState/ZoneContainer responsibility.</w:t>
+        <w:t>☐ Do not assign gameplay location by mutating CardInstance or by treating Deck membership as a zone; placement remains GameState/ZoneContainer responsibility.</w:t>
       </w:r>
     </w:p>
     <w:p>
@@ -829,13 +907,13 @@
         <w:pStyle w:val="Heading1"/>
       </w:pPr>
       <w:r>
-        <w:t>14. Add an imported-deck result model</w:t>
+        <w:t>15. Add an imported-deck result model</w:t>
       </w:r>
     </w:p>
     <w:p>
       <w:pPr/>
       <w:r>
-        <w:t>☐ Return or construct a result that clearly separates successful card instances from import errors.</w:t>
+        <w:t>☐ Return or construct a result that clearly separates the successfully constructed Deck from import errors.</w:t>
       </w:r>
     </w:p>
     <w:p>
@@ -861,7 +939,7 @@
         <w:pStyle w:val="Heading1"/>
       </w:pPr>
       <w:r>
-        <w:t>15. Add offline unit tests</w:t>
+        <w:t>16. Add offline unit tests</w:t>
       </w:r>
     </w:p>
     <w:p>
@@ -933,7 +1011,7 @@
     <w:p>
       <w:pPr/>
       <w:r>
-        <w:t>☐ Test MtgCardDefinitionInterrogator exposes the expected M2 field description without performing terminal or HTTP I/O.</w:t>
+        <w:t>☑ Test CardDefinitionInterrogator can be instantiated, load the MTG JSON field template, and return expected fields without performing terminal or HTTP I/O. Current full backend checkpoint: 50 tests passed with only the known FastAPI/Starlette deprecation warnings.</w:t>
       </w:r>
     </w:p>
     <w:p>
@@ -945,6 +1023,24 @@
     <w:p>
       <w:pPr/>
       <w:r>
+        <w:t>☐ Test Deck accepts/contains CardInstance objects and preserves exact object identity.</w:t>
+      </w:r>
+    </w:p>
+    <w:p>
+      <w:pPr/>
+      <w:r>
+        <w:t>☐ Test Deck count/content is preserved independently of GameState and that creating/importing a Deck does not place cards into zones.</w:t>
+      </w:r>
+    </w:p>
+    <w:p>
+      <w:pPr/>
+      <w:r>
+        <w:t>☐ Test any minimal Deck add/remove behavior chosen for M2 without introducing shuffle/draw or gameplay legality.</w:t>
+      </w:r>
+    </w:p>
+    <w:p>
+      <w:pPr/>
+      <w:r>
         <w:t>☐ Test invalid manual field input is rejected or reported clearly.</w:t>
       </w:r>
     </w:p>
@@ -957,13 +1053,13 @@
     <w:p>
       <w:pPr/>
       <w:r>
-        <w:t>☐ Test that N requested copies produce N distinct CardInstance IDs.</w:t>
+        <w:t>☐ Test that N requested copies produce N distinct CardInstance IDs and that the resulting Deck contains exactly those N instances.</w:t>
       </w:r>
     </w:p>
     <w:p>
       <w:pPr/>
       <w:r>
-        <w:t>☐ Test that multiple instances of one card reference the expected shared CardDefinition.</w:t>
+        <w:t>☐ Test that multiple Deck instances of one card reference the expected shared CardDefinition while retaining distinct instance IDs.</w:t>
       </w:r>
     </w:p>
     <w:p>
@@ -989,7 +1085,7 @@
         <w:pStyle w:val="Heading1"/>
       </w:pPr>
       <w:r>
-        <w:t>16. Test the catalog boundary without live Scryfall</w:t>
+        <w:t>17. Test the catalog boundary without live Scryfall</w:t>
       </w:r>
     </w:p>
     <w:p>
@@ -1045,7 +1141,7 @@
         <w:pStyle w:val="Heading1"/>
       </w:pPr>
       <w:r>
-        <w:t>17. Add a small optional live Scryfall integration test</w:t>
+        <w:t>18. Add a small optional live Scryfall integration test</w:t>
       </w:r>
     </w:p>
     <w:p>
@@ -1077,7 +1173,7 @@
         <w:pStyle w:val="Heading1"/>
       </w:pPr>
       <w:r>
-        <w:t>18. Run the M2 acceptance scenarios</w:t>
+        <w:t>19. Run the M2 acceptance scenarios</w:t>
       </w:r>
     </w:p>
     <w:p>
@@ -1107,7 +1203,7 @@
     <w:p>
       <w:pPr/>
       <w:r>
-        <w:t>☐ Create the correct total number of CardInstance objects.</w:t>
+        <w:t>☐ Create the correct total number of CardInstance objects and collect them in a Deck.</w:t>
       </w:r>
     </w:p>
     <w:p>
@@ -1137,13 +1233,25 @@
     <w:p>
       <w:pPr/>
       <w:r>
-        <w:t>☐ Verify no GameState zone membership is created or changed as a side effect of import.</w:t>
+        <w:t>☐ Verify Deck construction/import does not create or change GameState zone membership and Deck is not treated as a gameplay location authority.</w:t>
       </w:r>
     </w:p>
     <w:p>
       <w:pPr/>
       <w:r>
         <w:t>☐ Enter at least one custom/local card through the CLI-facing manual-entry path and verify it produces a valid CardDefinition available through LocalCatalog.</w:t>
+      </w:r>
+    </w:p>
+    <w:p>
+      <w:pPr/>
+      <w:r>
+        <w:t>☐ Exercise the CLI-facing flow that acquires one or more definitions through a supplied catalog without letting the CLI call Scryfall transport directly.</w:t>
+      </w:r>
+    </w:p>
+    <w:p>
+      <w:pPr/>
+      <w:r>
+        <w:t>☐ Exercise CLI deck creation/import sufficiently to prove that user input can produce a Deck containing the expected CardInstance objects; persistence restore is not part of this scenario.</w:t>
       </w:r>
     </w:p>
     <w:p>
@@ -1157,7 +1265,7 @@
         <w:pStyle w:val="Heading1"/>
       </w:pPr>
       <w:r>
-        <w:t>19. Preserve M0 and M1 behavior</w:t>
+        <w:t>20. Preserve M0 and M1 behavior</w:t>
       </w:r>
     </w:p>
     <w:p>
@@ -1195,7 +1303,7 @@
         <w:pStyle w:val="Heading1"/>
       </w:pPr>
       <w:r>
-        <w:t>20. Architecture review checkpoint</w:t>
+        <w:t>21. Architecture review checkpoint</w:t>
       </w:r>
     </w:p>
     <w:p>
@@ -1207,7 +1315,7 @@
     <w:p>
       <w:pPr/>
       <w:r>
-        <w:t>☐ Review that MtgCardDefinitionInterrogator describes MTG manual-entry fields without owning CLI input or API rendering, so both presentation paths can reuse it.</w:t>
+        <w:t>☐ Review that CardDefinitionInterrogator only exposes the selected game field template while ManualCardEntryCLI owns prompting and future app/api code owns web rendering; presentation layers should share the same template rather than duplicating MTG field lists.</w:t>
       </w:r>
     </w:p>
     <w:p>
@@ -1244,6 +1352,18 @@
       <w:pPr/>
       <w:r>
         <w:t>☐ Review that deck import creates card instances but does not become a second authority for card location.</w:t>
+      </w:r>
+    </w:p>
+    <w:p>
+      <w:pPr/>
+      <w:r>
+        <w:t>☐ Review that Deck is a pre-game CardInstance collection only, is not a ZoneContainer substitute, and does not become a second authority for card location.</w:t>
+      </w:r>
+    </w:p>
+    <w:p>
+      <w:pPr/>
+      <w:r>
+        <w:t>☐ Review that Deck and ZoneContainer remain separate domain concepts with no shared ABC introduced merely for collection similarity, and that any future Deck-to-library initialization is orchestrated by GameState rather than by direct ZoneContainer loading.</w:t>
       </w:r>
     </w:p>
     <w:p>
@@ -1275,7 +1395,7 @@
         <w:pStyle w:val="Heading1"/>
       </w:pPr>
       <w:r>
-        <w:t>21. Documentation and repository completion</w:t>
+        <w:t>22. Documentation and repository completion</w:t>
       </w:r>
     </w:p>
     <w:p>
@@ -1293,7 +1413,7 @@
     <w:p>
       <w:pPr/>
       <w:r>
-        <w:t>☐ Document the shared CardDefinition acquisition flow, ScryfallCatalog/ScryfallAdapter composition, and the MtgCardDefinitionInterrogator → CLI → LocalCatalog manual-entry path.</w:t>
+        <w:t>☐ Document the shared CardDefinition acquisition flow, ScryfallCatalog/ScryfallAdapter composition, the data-driven CardDefinitionInterrogator template, the CLI/manual-entry path, and Deck construction/import boundaries.</w:t>
       </w:r>
     </w:p>
     <w:p>
@@ -1379,6 +1499,12 @@
     <w:p>
       <w:pPr/>
       <w:r>
+        <w:t>☐ Deferred: Persistent Deck/Catalog repositories, save/load formats, or database-backed restoration of previously stored Deck and catalog objects.</w:t>
+      </w:r>
+    </w:p>
+    <w:p>
+      <w:pPr/>
+      <w:r>
         <w:t>☐ Deferred: Downloading/importing complete deck lists from third-party deck-hosting services</w:t>
       </w:r>
     </w:p>
@@ -1392,6 +1518,12 @@
       <w:pPr/>
       <w:r>
         <w:t>☐ Deferred: Starting a GameState from the imported deck beyond any minimal test fixture needed to prove interoperability</w:t>
+      </w:r>
+    </w:p>
+    <w:p>
+      <w:pPr/>
+      <w:r>
+        <w:t>☐ Deferred: GameState.initialize_library/load_deck workflow that transfers the same Deck CardInstance objects into the player library through authoritative GameState placement.</w:t>
       </w:r>
     </w:p>
     <w:p>
@@ -1489,7 +1621,7 @@
     <w:p>
       <w:pPr/>
       <w:r>
-        <w:t>☐ MtgCardDefinitionInterrogator describes the required MTG manual-entry fields, and ManualCardEntryCLI can use that description to collect values and construct valid CardDefinition objects without a web UI.</w:t>
+        <w:t>☐ CardDefinitionInterrogator can load and expose the MTG manual-entry field template, and ManualCardEntryCLI can use that field list to collect values and construct valid CardDefinition objects without a web UI.</w:t>
       </w:r>
     </w:p>
     <w:p>
@@ -1513,12 +1645,24 @@
     <w:p>
       <w:pPr/>
       <w:r>
-        <w:t>☐ Resolved quantities produce the correct number of distinct CardInstance objects.</w:t>
+        <w:t>☐ Resolved quantities produce the correct number of distinct CardInstance objects collected in a Deck.</w:t>
       </w:r>
     </w:p>
     <w:p>
       <w:pPr/>
       <w:r>
+        <w:t>☐ Deck preserves CardInstance identity and remains separate from authoritative GameState zone membership.</w:t>
+      </w:r>
+    </w:p>
+    <w:p>
+      <w:pPr/>
+      <w:r>
+        <w:t>☐ Deck-building/editing APIs remain separate from live ZoneContainer mutation; Deck cannot serve as a back door for changing active-game library contents.</w:t>
+      </w:r>
+    </w:p>
+    <w:p>
+      <w:pPr/>
+      <w:r>
         <w:t>☐ Copies of one card preserve shared definition identity while retaining independent instance identity.</w:t>
       </w:r>
     </w:p>
@@ -1561,7 +1705,7 @@
     <w:p>
       <w:pPr/>
       <w:r>
-        <w:t>M2 outcome: we can turn a human-readable MTG deck file into trustworthy CardDefinition objects with stable universal identity plus appropriately isolated game-specific descriptive data, create distinct in-memory CardInstance objects, create custom/local definitions through a reusable MTG field-description + CLI path, and resolve missing definitions through ScryfallCatalog composed with a provider-specific adapter while keeping provider concerns outside the core game model.</w:t>
+        <w:t>M2 outcome: we can turn a human-readable MTG deck file into trustworthy CardDefinition objects with stable universal identity plus appropriately isolated game-specific descriptive data, create distinct in-memory CardInstance objects collected in a pre-game Deck, create custom/local definitions through a reusable data-driven field-template + CLI path, and resolve missing definitions through ScryfallCatalog composed with a provider-specific adapter while keeping provider concerns outside the core game model.</w:t>
       </w:r>
     </w:p>
     <w:sectPr>

</xml_diff>